<commit_message>
Remove the app-only crosswalk demo mode
The demo will run with the Raspberry Pi, so drop the ESP32 + Flutter
fallback (demo card, red/green buttons, green countdown, voice triggers
and the stored-heading steering). Steering helpers go back to the single
navigation thresholds. Obstacle voice guidance and the 2.5 s pause after
OBSTACLE_CLEAR stay.

Demo guide updated to match (fallback section, tuning table, safety Q4).

Co-Authored-By: Claude Opus 5.5 <noreply@anthropic.com>
Claude-Session: https://claude.ai/code/session_01Xr86TUhdCVDSPSiQQzdNfQ
</commit_message>
<xml_diff>
--- a/docs/Navis_시연가이드_예상질문.docx
+++ b/docs/Navis_시연가이드_예상질문.docx
@@ -2278,7 +2278,7 @@
         <w:t xml:space="preserve">Pi 인식이 불안정할 때: </w:t>
       </w:r>
       <w:r>
-        <w:t xml:space="preserve">앱의 "횡단보도 시연" 모드로 전환. 버튼으로 신호를 넣고, 저장한 나침반 방향으로 직진을 유지함 (ESP32 + 앱만 사용)</w:t>
+        <w:t xml:space="preserve">main.py를 다시 실행하고, 카메라 케이블·조명·신호등 위치를 확인. HUD에서 횡단보도 박스와 신호 색이 잡히는지 본 뒤 다시 시작</w:t>
       </w:r>
     </w:p>
     <w:p>
@@ -2295,10 +2295,10 @@
           <w:b/>
           <w:bCs/>
         </w:rPr>
-        <w:t xml:space="preserve">앱 시연 모드 초록불 시간: </w:t>
-      </w:r>
-      <w:r>
-        <w:t xml:space="preserve">20초 카운트다운, 5초 남으면 경고. 다 건넜으면 "건너기 완료" 버튼을 누름 (crossingGreenSeconds로 조정)</w:t>
+        <w:t xml:space="preserve">모터가 반대로 당길 때: </w:t>
+      </w:r>
+      <w:r>
+        <w:t xml:space="preserve">main.py의 FLIP_LEFT_RIGHT 값을 바꾸고 다시 실행</w:t>
       </w:r>
     </w:p>
     <w:p>
@@ -3512,135 +3512,6 @@
           </w:p>
         </w:tc>
       </w:tr>
-      <w:tr>
-        <w:trPr>
-          <w:tblHeader w:val="off"/>
-        </w:trPr>
-        <w:tc>
-          <w:tcPr>
-            <w:tcW w:type="dxa" w:w="2000"/>
-            <w:tcBorders>
-              <w:top w:val="single" w:color="BFBFBF" w:sz="4"/>
-              <w:left w:val="single" w:color="BFBFBF" w:sz="4"/>
-              <w:bottom w:val="single" w:color="BFBFBF" w:sz="4"/>
-              <w:right w:val="single" w:color="BFBFBF" w:sz="4"/>
-            </w:tcBorders>
-            <w:tcMar>
-              <w:top w:type="dxa" w:w="70"/>
-              <w:left w:type="dxa" w:w="110"/>
-              <w:bottom w:type="dxa" w:w="70"/>
-              <w:right w:type="dxa" w:w="110"/>
-            </w:tcMar>
-          </w:tcPr>
-          <w:p>
-            <w:pPr>
-              <w:spacing w:after="20" w:line="270"/>
-            </w:pPr>
-            <w:r>
-              <w:rPr>
-                <w:b w:val="false"/>
-                <w:bCs w:val="false"/>
-                <w:sz w:val="19"/>
-                <w:szCs w:val="19"/>
-              </w:rPr>
-              <w:t xml:space="preserve">앱</w:t>
-            </w:r>
-          </w:p>
-        </w:tc>
-        <w:tc>
-          <w:tcPr>
-            <w:tcW w:type="dxa" w:w="3000"/>
-            <w:tcBorders>
-              <w:top w:val="single" w:color="BFBFBF" w:sz="4"/>
-              <w:left w:val="single" w:color="BFBFBF" w:sz="4"/>
-              <w:bottom w:val="single" w:color="BFBFBF" w:sz="4"/>
-              <w:right w:val="single" w:color="BFBFBF" w:sz="4"/>
-            </w:tcBorders>
-            <w:tcMar>
-              <w:top w:type="dxa" w:w="70"/>
-              <w:left w:type="dxa" w:w="110"/>
-              <w:bottom w:type="dxa" w:w="70"/>
-              <w:right w:type="dxa" w:w="110"/>
-            </w:tcMar>
-          </w:tcPr>
-          <w:p>
-            <w:pPr>
-              <w:spacing w:after="20" w:line="270"/>
-            </w:pPr>
-            <w:r>
-              <w:rPr>
-                <w:b w:val="false"/>
-                <w:bCs w:val="false"/>
-                <w:sz w:val="19"/>
-                <w:szCs w:val="19"/>
-              </w:rPr>
-              <w:t xml:space="preserve">crossingGreenSeconds</w:t>
-            </w:r>
-          </w:p>
-        </w:tc>
-        <w:tc>
-          <w:tcPr>
-            <w:tcW w:type="dxa" w:w="1300"/>
-            <w:tcBorders>
-              <w:top w:val="single" w:color="BFBFBF" w:sz="4"/>
-              <w:left w:val="single" w:color="BFBFBF" w:sz="4"/>
-              <w:bottom w:val="single" w:color="BFBFBF" w:sz="4"/>
-              <w:right w:val="single" w:color="BFBFBF" w:sz="4"/>
-            </w:tcBorders>
-            <w:tcMar>
-              <w:top w:type="dxa" w:w="70"/>
-              <w:left w:type="dxa" w:w="110"/>
-              <w:bottom w:type="dxa" w:w="70"/>
-              <w:right w:type="dxa" w:w="110"/>
-            </w:tcMar>
-          </w:tcPr>
-          <w:p>
-            <w:pPr>
-              <w:spacing w:after="20" w:line="270"/>
-            </w:pPr>
-            <w:r>
-              <w:rPr>
-                <w:b w:val="false"/>
-                <w:bCs w:val="false"/>
-                <w:sz w:val="19"/>
-                <w:szCs w:val="19"/>
-              </w:rPr>
-              <w:t xml:space="preserve">20초</w:t>
-            </w:r>
-          </w:p>
-        </w:tc>
-        <w:tc>
-          <w:tcPr>
-            <w:tcW w:type="dxa" w:w="2726"/>
-            <w:tcBorders>
-              <w:top w:val="single" w:color="BFBFBF" w:sz="4"/>
-              <w:left w:val="single" w:color="BFBFBF" w:sz="4"/>
-              <w:bottom w:val="single" w:color="BFBFBF" w:sz="4"/>
-              <w:right w:val="single" w:color="BFBFBF" w:sz="4"/>
-            </w:tcBorders>
-            <w:tcMar>
-              <w:top w:type="dxa" w:w="70"/>
-              <w:left w:type="dxa" w:w="110"/>
-              <w:bottom w:type="dxa" w:w="70"/>
-              <w:right w:type="dxa" w:w="110"/>
-            </w:tcMar>
-          </w:tcPr>
-          <w:p>
-            <w:pPr>
-              <w:spacing w:after="20" w:line="270"/>
-            </w:pPr>
-            <w:r>
-              <w:rPr>
-                <w:b w:val="false"/>
-                <w:bCs w:val="false"/>
-                <w:sz w:val="19"/>
-                <w:szCs w:val="19"/>
-              </w:rPr>
-              <w:t xml:space="preserve">앱 시연 모드 초록불 시간</w:t>
-            </w:r>
-          </w:p>
-        </w:tc>
-      </w:tr>
     </w:tbl>
     <w:p>
       <w:pPr>
@@ -4352,7 +4223,7 @@
         <w:t xml:space="preserve">A. </w:t>
       </w:r>
       <w:r>
-        <w:t xml:space="preserve">한가운데서 멈추는 것이 더 위험하므로 멈추라고 하지 않고, 방향 유지를 계속하면서 "끝까지 건너세요"라고 안내합니다. 앱 시연 모드에서는 남은 시간 5초 전에 미리 경고합니다.</w:t>
+        <w:t xml:space="preserve">한가운데서 멈추는 것이 더 위험하므로, 건너기 시작한 뒤에는 멈추게 하지 않고 방향 보정을 계속해 끝까지 건너게 합니다. 출발 조건을 "빨간불 → 초록불로 바뀌는 순간"으로 제한한 것도 초록불 시간을 최대한 확보하기 위해서입니다. 개선 계획: 건너는 중에도 신호를 감시해 신호가 바뀌면 "서둘러 건너세요"라고 안내.</w:t>
       </w:r>
     </w:p>
     <w:p>

</xml_diff>